<commit_message>
go routines vs C# async tasks
</commit_message>
<xml_diff>
--- a/1 - C#.docx
+++ b/1 - C#.docx
@@ -1,6 +1,6 @@
 
 <file path=word/document.xml><?xml version="1.0" encoding="utf-8"?>
-<w:document xmlns:wpc="http://schemas.microsoft.com/office/word/2010/wordprocessingCanvas" xmlns:cx="http://schemas.microsoft.com/office/drawing/2014/chartex" xmlns:cx1="http://schemas.microsoft.com/office/drawing/2015/9/8/chartex" xmlns:cx2="http://schemas.microsoft.com/office/drawing/2015/10/21/chartex" xmlns:cx3="http://schemas.microsoft.com/office/drawing/2016/5/9/chartex" xmlns:cx4="http://schemas.microsoft.com/office/drawing/2016/5/10/chartex" xmlns:cx5="http://schemas.microsoft.com/office/drawing/2016/5/11/chartex" xmlns:cx6="http://schemas.microsoft.com/office/drawing/2016/5/12/chartex" xmlns:cx7="http://schemas.microsoft.com/office/drawing/2016/5/13/chartex" xmlns:cx8="http://schemas.microsoft.com/office/drawing/2016/5/14/chartex" xmlns:mc="http://schemas.openxmlformats.org/markup-compatibility/2006" xmlns:aink="http://schemas.microsoft.com/office/drawing/2016/ink" xmlns:am3d="http://schemas.microsoft.com/office/drawing/2017/model3d" xmlns:o="urn:schemas-microsoft-com:office:office" xmlns:oel="http://schemas.microsoft.com/office/2019/extlst" xmlns:r="http://schemas.openxmlformats.org/officeDocument/2006/relationships" xmlns:m="http://schemas.openxmlformats.org/officeDocument/2006/math" xmlns:v="urn:schemas-microsoft-com:vml" xmlns:wp14="http://schemas.microsoft.com/office/word/2010/wordprocessingDrawing" xmlns:wp="http://schemas.openxmlformats.org/drawingml/2006/wordprocessingDrawing" xmlns:w10="urn:schemas-microsoft-com:office:word" xmlns:w="http://schemas.openxmlformats.org/wordprocessingml/2006/main" xmlns:w14="http://schemas.microsoft.com/office/word/2010/wordml" xmlns:w15="http://schemas.microsoft.com/office/word/2012/wordml" xmlns:w16cei="http://schemas.microsoft.com/office/word/2026/wordml/cei" xmlns:w16cex="http://schemas.microsoft.com/office/word/2018/wordml/cex" xmlns:w16cid="http://schemas.microsoft.com/office/word/2016/wordml/cid" xmlns:w16="http://schemas.microsoft.com/office/word/2018/wordml" xmlns:w16du="http://schemas.microsoft.com/office/word/2023/wordml/word16du" xmlns:w16sdtdh="http://schemas.microsoft.com/office/word/2020/wordml/sdtdatahash" xmlns:w16sdtfl="http://schemas.microsoft.com/office/word/2024/wordml/sdtformatlock" xmlns:w16se="http://schemas.microsoft.com/office/word/2015/wordml/symex" xmlns:wpg="http://schemas.microsoft.com/office/word/2010/wordprocessingGroup" xmlns:wpi="http://schemas.microsoft.com/office/word/2010/wordprocessingInk" xmlns:wne="http://schemas.microsoft.com/office/word/2006/wordml" xmlns:wps="http://schemas.microsoft.com/office/word/2010/wordprocessingShape" mc:Ignorable="w14 w15 w16se w16cid w16 w16cex w16sdtdh w16sdtfl w16du wp14">
+<w:document xmlns:wpc="http://schemas.microsoft.com/office/word/2010/wordprocessingCanvas" xmlns:cx="http://schemas.microsoft.com/office/drawing/2014/chartex" xmlns:cx1="http://schemas.microsoft.com/office/drawing/2015/9/8/chartex" xmlns:cx2="http://schemas.microsoft.com/office/drawing/2015/10/21/chartex" xmlns:cx3="http://schemas.microsoft.com/office/drawing/2016/5/9/chartex" xmlns:cx4="http://schemas.microsoft.com/office/drawing/2016/5/10/chartex" xmlns:cx5="http://schemas.microsoft.com/office/drawing/2016/5/11/chartex" xmlns:cx6="http://schemas.microsoft.com/office/drawing/2016/5/12/chartex" xmlns:cx7="http://schemas.microsoft.com/office/drawing/2016/5/13/chartex" xmlns:cx8="http://schemas.microsoft.com/office/drawing/2016/5/14/chartex" xmlns:mc="http://schemas.openxmlformats.org/markup-compatibility/2006" xmlns:aink="http://schemas.microsoft.com/office/drawing/2016/ink" xmlns:am3d="http://schemas.microsoft.com/office/drawing/2017/model3d" xmlns:o="urn:schemas-microsoft-com:office:office" xmlns:oel="http://schemas.microsoft.com/office/2019/extlst" xmlns:r="http://schemas.openxmlformats.org/officeDocument/2006/relationships" xmlns:m="http://schemas.openxmlformats.org/officeDocument/2006/math" xmlns:v="urn:schemas-microsoft-com:vml" xmlns:wp14="http://schemas.microsoft.com/office/word/2010/wordprocessingDrawing" xmlns:wp="http://schemas.openxmlformats.org/drawingml/2006/wordprocessingDrawing" xmlns:w10="urn:schemas-microsoft-com:office:word" xmlns:w="http://schemas.openxmlformats.org/wordprocessingml/2006/main" xmlns:w14="http://schemas.microsoft.com/office/word/2010/wordml" xmlns:w15="http://schemas.microsoft.com/office/word/2012/wordml" xmlns:w16cex="http://schemas.microsoft.com/office/word/2018/wordml/cex" xmlns:w16cid="http://schemas.microsoft.com/office/word/2016/wordml/cid" xmlns:w16="http://schemas.microsoft.com/office/word/2018/wordml" xmlns:w16du="http://schemas.microsoft.com/office/word/2023/wordml/word16du" xmlns:w16sdtdh="http://schemas.microsoft.com/office/word/2020/wordml/sdtdatahash" xmlns:w16sdtfl="http://schemas.microsoft.com/office/word/2024/wordml/sdtformatlock" xmlns:w16se="http://schemas.microsoft.com/office/word/2015/wordml/symex" xmlns:wpg="http://schemas.microsoft.com/office/word/2010/wordprocessingGroup" xmlns:wpi="http://schemas.microsoft.com/office/word/2010/wordprocessingInk" xmlns:wne="http://schemas.microsoft.com/office/word/2006/wordml" xmlns:wps="http://schemas.microsoft.com/office/word/2010/wordprocessingShape" mc:Ignorable="w14 w15 w16se w16cid w16 w16cex w16sdtdh w16sdtfl w16du wp14">
   <w:body>
     <w:p>
       <w:pPr>
@@ -8124,6 +8124,91 @@
     </w:p>
     <w:p/>
     <w:p/>
+    <w:p>
+      <w:r>
+        <w:lastRenderedPageBreak/>
+        <w:drawing>
+          <wp:anchor distT="0" distB="0" distL="114300" distR="114300" simplePos="0" relativeHeight="251660288" behindDoc="0" locked="0" layoutInCell="1" allowOverlap="1" wp14:anchorId="1ED859C4" wp14:editId="09C1C971">
+            <wp:simplePos x="0" y="0"/>
+            <wp:positionH relativeFrom="margin">
+              <wp:align>center</wp:align>
+            </wp:positionH>
+            <wp:positionV relativeFrom="paragraph">
+              <wp:posOffset>190500</wp:posOffset>
+            </wp:positionV>
+            <wp:extent cx="7119117" cy="5341620"/>
+            <wp:effectExtent l="190500" t="190500" r="196215" b="182880"/>
+            <wp:wrapTopAndBottom/>
+            <wp:docPr id="14845396" name="Picture 2"/>
+            <wp:cNvGraphicFramePr>
+              <a:graphicFrameLocks xmlns:a="http://schemas.openxmlformats.org/drawingml/2006/main" noChangeAspect="1"/>
+            </wp:cNvGraphicFramePr>
+            <a:graphic xmlns:a="http://schemas.openxmlformats.org/drawingml/2006/main">
+              <a:graphicData uri="http://schemas.openxmlformats.org/drawingml/2006/picture">
+                <pic:pic xmlns:pic="http://schemas.openxmlformats.org/drawingml/2006/picture">
+                  <pic:nvPicPr>
+                    <pic:cNvPr id="0" name="Picture 6"/>
+                    <pic:cNvPicPr>
+                      <a:picLocks noChangeAspect="1" noChangeArrowheads="1"/>
+                    </pic:cNvPicPr>
+                  </pic:nvPicPr>
+                  <pic:blipFill>
+                    <a:blip r:embed="rId5" cstate="print">
+                      <a:extLst>
+                        <a:ext uri="{28A0092B-C50C-407E-A947-70E740481C1C}">
+                          <a14:useLocalDpi xmlns:a14="http://schemas.microsoft.com/office/drawing/2010/main" val="0"/>
+                        </a:ext>
+                      </a:extLst>
+                    </a:blip>
+                    <a:srcRect/>
+                    <a:stretch>
+                      <a:fillRect/>
+                    </a:stretch>
+                  </pic:blipFill>
+                  <pic:spPr bwMode="auto">
+                    <a:xfrm>
+                      <a:off x="0" y="0"/>
+                      <a:ext cx="7119117" cy="5341620"/>
+                    </a:xfrm>
+                    <a:prstGeom prst="rect">
+                      <a:avLst/>
+                    </a:prstGeom>
+                    <a:ln>
+                      <a:noFill/>
+                    </a:ln>
+                    <a:effectLst>
+                      <a:outerShdw blurRad="190500" algn="tl" rotWithShape="0">
+                        <a:srgbClr val="000000">
+                          <a:alpha val="70000"/>
+                        </a:srgbClr>
+                      </a:outerShdw>
+                    </a:effectLst>
+                  </pic:spPr>
+                </pic:pic>
+              </a:graphicData>
+            </a:graphic>
+            <wp14:sizeRelH relativeFrom="margin">
+              <wp14:pctWidth>0</wp14:pctWidth>
+            </wp14:sizeRelH>
+            <wp14:sizeRelV relativeFrom="margin">
+              <wp14:pctHeight>0</wp14:pctHeight>
+            </wp14:sizeRelV>
+          </wp:anchor>
+        </w:drawing>
+      </w:r>
+    </w:p>
+    <w:p>
+      <w:pPr>
+        <w:rPr>
+          <w:rFonts w:asciiTheme="majorBidi" w:eastAsiaTheme="majorEastAsia" w:hAnsiTheme="majorBidi"/>
+          <w:sz w:val="40"/>
+          <w:szCs w:val="40"/>
+        </w:rPr>
+      </w:pPr>
+      <w:r>
+        <w:br w:type="page"/>
+      </w:r>
+    </w:p>
     <w:p>
       <w:pPr>
         <w:pStyle w:val="Heading1"/>
@@ -9971,7 +10056,7 @@
                 <wp:cNvGraphicFramePr/>
                 <a:graphic xmlns:a="http://schemas.openxmlformats.org/drawingml/2006/main">
                   <a:graphicData uri="http://schemas.microsoft.com/office/word/2010/wordprocessingInk">
-                    <w14:contentPart bwMode="auto" r:id="rId5">
+                    <w14:contentPart bwMode="auto" r:id="rId6">
                       <w14:nvContentPartPr>
                         <w14:cNvContentPartPr/>
                       </w14:nvContentPartPr>
@@ -9985,7 +10070,7 @@
               </wp:anchor>
             </w:drawing>
           </mc:Choice>
-          <mc:Fallback>
+          <mc:Fallback xmlns:w16cei="http://schemas.microsoft.com/office/word/2026/wordml/cei">
             <w:pict>
               <v:shapetype w14:anchorId="1B679423" id="_x0000_t75" coordsize="21600,21600" o:spt="75" o:preferrelative="t" path="m@4@5l@4@11@9@11@9@5xe" filled="f" stroked="f">
                 <v:stroke joinstyle="miter"/>
@@ -10007,7 +10092,7 @@
                 <o:lock v:ext="edit" aspectratio="t"/>
               </v:shapetype>
               <v:shape id="Ink 1" o:spid="_x0000_s1026" type="#_x0000_t75" style="position:absolute;margin-left:34.1pt;margin-top:-14.4pt;width:302pt;height:41.4pt;z-index:251659264;visibility:visible;mso-wrap-style:square;mso-wrap-distance-left:9pt;mso-wrap-distance-top:0;mso-wrap-distance-right:9pt;mso-wrap-distance-bottom:0;mso-position-horizontal:absolute;mso-position-horizontal-relative:text;mso-position-vertical:absolute;mso-position-vertical-relative:text" o:gfxdata="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">
-                <v:imagedata r:id="rId6" o:title=""/>
+                <v:imagedata r:id="rId7" o:title=""/>
               </v:shape>
             </w:pict>
           </mc:Fallback>
@@ -11615,7 +11700,7 @@
 </file>
 
 <file path=word/numbering.xml><?xml version="1.0" encoding="utf-8"?>
-<w:numbering xmlns:wpc="http://schemas.microsoft.com/office/word/2010/wordprocessingCanvas" xmlns:cx="http://schemas.microsoft.com/office/drawing/2014/chartex" xmlns:cx1="http://schemas.microsoft.com/office/drawing/2015/9/8/chartex" xmlns:cx2="http://schemas.microsoft.com/office/drawing/2015/10/21/chartex" xmlns:cx3="http://schemas.microsoft.com/office/drawing/2016/5/9/chartex" xmlns:cx4="http://schemas.microsoft.com/office/drawing/2016/5/10/chartex" xmlns:cx5="http://schemas.microsoft.com/office/drawing/2016/5/11/chartex" xmlns:cx6="http://schemas.microsoft.com/office/drawing/2016/5/12/chartex" xmlns:cx7="http://schemas.microsoft.com/office/drawing/2016/5/13/chartex" xmlns:cx8="http://schemas.microsoft.com/office/drawing/2016/5/14/chartex" xmlns:mc="http://schemas.openxmlformats.org/markup-compatibility/2006" xmlns:aink="http://schemas.microsoft.com/office/drawing/2016/ink" xmlns:am3d="http://schemas.microsoft.com/office/drawing/2017/model3d" xmlns:o="urn:schemas-microsoft-com:office:office" xmlns:oel="http://schemas.microsoft.com/office/2019/extlst" xmlns:r="http://schemas.openxmlformats.org/officeDocument/2006/relationships" xmlns:m="http://schemas.openxmlformats.org/officeDocument/2006/math" xmlns:v="urn:schemas-microsoft-com:vml" xmlns:wp14="http://schemas.microsoft.com/office/word/2010/wordprocessingDrawing" xmlns:wp="http://schemas.openxmlformats.org/drawingml/2006/wordprocessingDrawing" xmlns:w10="urn:schemas-microsoft-com:office:word" xmlns:w="http://schemas.openxmlformats.org/wordprocessingml/2006/main" xmlns:w14="http://schemas.microsoft.com/office/word/2010/wordml" xmlns:w15="http://schemas.microsoft.com/office/word/2012/wordml" xmlns:w16cei="http://schemas.microsoft.com/office/word/2026/wordml/cei" xmlns:w16cex="http://schemas.microsoft.com/office/word/2018/wordml/cex" xmlns:w16cid="http://schemas.microsoft.com/office/word/2016/wordml/cid" xmlns:w16="http://schemas.microsoft.com/office/word/2018/wordml" xmlns:w16du="http://schemas.microsoft.com/office/word/2023/wordml/word16du" xmlns:w16sdtdh="http://schemas.microsoft.com/office/word/2020/wordml/sdtdatahash" xmlns:w16sdtfl="http://schemas.microsoft.com/office/word/2024/wordml/sdtformatlock" xmlns:w16se="http://schemas.microsoft.com/office/word/2015/wordml/symex" xmlns:wpg="http://schemas.microsoft.com/office/word/2010/wordprocessingGroup" xmlns:wpi="http://schemas.microsoft.com/office/word/2010/wordprocessingInk" xmlns:wne="http://schemas.microsoft.com/office/word/2006/wordml" xmlns:wps="http://schemas.microsoft.com/office/word/2010/wordprocessingShape" mc:Ignorable="w14 w15 w16se w16cid w16 w16cex w16sdtdh w16sdtfl w16du wp14">
+<w:numbering xmlns:wpc="http://schemas.microsoft.com/office/word/2010/wordprocessingCanvas" xmlns:cx="http://schemas.microsoft.com/office/drawing/2014/chartex" xmlns:cx1="http://schemas.microsoft.com/office/drawing/2015/9/8/chartex" xmlns:cx2="http://schemas.microsoft.com/office/drawing/2015/10/21/chartex" xmlns:cx3="http://schemas.microsoft.com/office/drawing/2016/5/9/chartex" xmlns:cx4="http://schemas.microsoft.com/office/drawing/2016/5/10/chartex" xmlns:cx5="http://schemas.microsoft.com/office/drawing/2016/5/11/chartex" xmlns:cx6="http://schemas.microsoft.com/office/drawing/2016/5/12/chartex" xmlns:cx7="http://schemas.microsoft.com/office/drawing/2016/5/13/chartex" xmlns:cx8="http://schemas.microsoft.com/office/drawing/2016/5/14/chartex" xmlns:mc="http://schemas.openxmlformats.org/markup-compatibility/2006" xmlns:aink="http://schemas.microsoft.com/office/drawing/2016/ink" xmlns:am3d="http://schemas.microsoft.com/office/drawing/2017/model3d" xmlns:o="urn:schemas-microsoft-com:office:office" xmlns:oel="http://schemas.microsoft.com/office/2019/extlst" xmlns:r="http://schemas.openxmlformats.org/officeDocument/2006/relationships" xmlns:m="http://schemas.openxmlformats.org/officeDocument/2006/math" xmlns:v="urn:schemas-microsoft-com:vml" xmlns:wp14="http://schemas.microsoft.com/office/word/2010/wordprocessingDrawing" xmlns:wp="http://schemas.openxmlformats.org/drawingml/2006/wordprocessingDrawing" xmlns:w10="urn:schemas-microsoft-com:office:word" xmlns:w="http://schemas.openxmlformats.org/wordprocessingml/2006/main" xmlns:w14="http://schemas.microsoft.com/office/word/2010/wordml" xmlns:w15="http://schemas.microsoft.com/office/word/2012/wordml" xmlns:w16cex="http://schemas.microsoft.com/office/word/2018/wordml/cex" xmlns:w16cid="http://schemas.microsoft.com/office/word/2016/wordml/cid" xmlns:w16="http://schemas.microsoft.com/office/word/2018/wordml" xmlns:w16du="http://schemas.microsoft.com/office/word/2023/wordml/word16du" xmlns:w16sdtdh="http://schemas.microsoft.com/office/word/2020/wordml/sdtdatahash" xmlns:w16sdtfl="http://schemas.microsoft.com/office/word/2024/wordml/sdtformatlock" xmlns:w16se="http://schemas.microsoft.com/office/word/2015/wordml/symex" xmlns:wpg="http://schemas.microsoft.com/office/word/2010/wordprocessingGroup" xmlns:wpi="http://schemas.microsoft.com/office/word/2010/wordprocessingInk" xmlns:wne="http://schemas.microsoft.com/office/word/2006/wordml" xmlns:wps="http://schemas.microsoft.com/office/word/2010/wordprocessingShape" mc:Ignorable="w14 w15 w16se w16cid w16 w16cex w16sdtdh w16sdtfl w16du wp14">
   <w:abstractNum w:abstractNumId="0" w15:restartNumberingAfterBreak="0">
     <w:nsid w:val="067441BC"/>
     <w:multiLevelType w:val="multilevel"/>
@@ -12835,6 +12920,7 @@
   <w:style w:type="character" w:default="1" w:styleId="DefaultParagraphFont">
     <w:name w:val="Default Paragraph Font"/>
     <w:uiPriority w:val="1"/>
+    <w:semiHidden/>
     <w:unhideWhenUsed/>
   </w:style>
   <w:style w:type="table" w:default="1" w:styleId="TableNormal">

</xml_diff>